<commit_message>
Scale SASA programme to 6 sessions at R21,000 (R24,150 incl. VAT)
- Proposal V3: updated from 10 sessions to 6, Session 6 expanded with
  governance/roadmap afternoon close-out, extension block (Sessions 7-10)
- Condensed proposal: 6-session overview with extension pricing
- Quote: 6 sessions x R3,500 = R21,000, extension option (R16,100)
- Curriculum V5 (new): 6-session spec with prompt engineering thread
  through Sessions 1-3, expanded Session 6 governance/roadmap
- All documents regenerated as MD, HTML, and DOCX

Co-Authored-By: Claude Sonnet 4.6 <noreply@anthropic.com>
</commit_message>
<xml_diff>
--- a/docs/proposals/2026-03-23-sasa-ai-proposal-v3-condensed.docx
+++ b/docs/proposals/2026-03-23-sasa-ai-proposal-v3-condensed.docx
@@ -2,7 +2,7 @@
 <file path=word/document.xml><?xml version="1.0" encoding="utf-8"?>
 <w:document xmlns:w="http://schemas.openxmlformats.org/wordprocessingml/2006/main" xmlns:m="http://schemas.openxmlformats.org/officeDocument/2006/math" xmlns:r="http://schemas.openxmlformats.org/officeDocument/2006/relationships" xmlns:o="urn:schemas-microsoft-com:office:office" xmlns:v="urn:schemas-microsoft-com:vml" xmlns:w10="urn:schemas-microsoft-com:office:word" xmlns:a="http://schemas.openxmlformats.org/drawingml/2006/main" xmlns:pic="http://schemas.openxmlformats.org/drawingml/2006/picture" xmlns:wp="http://schemas.openxmlformats.org/drawingml/2006/wordprocessingDrawing">
   <w:body>
-    <w:bookmarkStart w:id="22" w:name="Xbcc2b5a52f8764163ad8eaec1d01b306addb7f4"/>
+    <w:bookmarkStart w:id="18" w:name="Xbcc2b5a52f8764163ad8eaec1d01b306addb7f4"/>
     <w:p>
       <w:pPr>
         <w:pStyle w:val="Heading1"/>
@@ -67,7 +67,7 @@
         <w:t xml:space="preserve"> </w:t>
       </w:r>
       <w:r>
-        <w:t xml:space="preserve">10 sessions × 7 hours | In-person, Mount Edgecombe | ~2 weeks between sessions</w:t>
+        <w:t xml:space="preserve">6 sessions × 7 hours | In-person, Mount Edgecombe | ~2 weeks between sessions</w:t>
       </w:r>
     </w:p>
     <w:p>
@@ -96,7 +96,7 @@
       </w:r>
     </w:p>
     <w:bookmarkEnd w:id="9"/>
-    <w:bookmarkStart w:id="20" w:name="programme-at-a-glance"/>
+    <w:bookmarkStart w:id="16" w:name="programme-at-a-glance"/>
     <w:p>
       <w:pPr>
         <w:pStyle w:val="Heading2"/>
@@ -333,7 +333,7 @@
         </w:numPr>
       </w:pPr>
       <w:r>
-        <w:t xml:space="preserve">Automation candidate list per team area (inputs for Sessions 7–8)</w:t>
+        <w:t xml:space="preserve">Automation candidate list per team area</w:t>
       </w:r>
     </w:p>
     <w:bookmarkEnd w:id="13"/>
@@ -395,13 +395,13 @@
       </w:r>
     </w:p>
     <w:bookmarkEnd w:id="14"/>
-    <w:bookmarkStart w:id="15" w:name="Xb8a1ac2a5b48eee129a0155e8f98954826544a3"/>
+    <w:bookmarkStart w:id="15" w:name="Xaa7b7628a98616831a468c52fcb8e6710e1e5c1"/>
     <w:p>
       <w:pPr>
         <w:pStyle w:val="Heading3"/>
       </w:pPr>
       <w:r>
-        <w:t xml:space="preserve">Session 6 — Running AI on SASA Infrastructure</w:t>
+        <w:t xml:space="preserve">Session 6 — Local AI Infrastructure, Governance &amp; Roadmap</w:t>
       </w:r>
     </w:p>
     <w:p>
@@ -446,238 +446,6 @@
         <w:numPr>
           <w:ilvl w:val="0"/>
           <w:numId w:val="1006"/>
-        </w:numPr>
-      </w:pPr>
-      <w:r>
-        <w:t xml:space="preserve">Local RAG: query SASA documents without internet</w:t>
-      </w:r>
-    </w:p>
-    <w:bookmarkEnd w:id="15"/>
-    <w:bookmarkStart w:id="16" w:name="session-7-lims-autolab-integration"/>
-    <w:p>
-      <w:pPr>
-        <w:pStyle w:val="Heading3"/>
-      </w:pPr>
-      <w:r>
-        <w:t xml:space="preserve">Session 7 — LIMS &amp; Autolab Integration</w:t>
-      </w:r>
-    </w:p>
-    <w:p>
-      <w:pPr>
-        <w:pStyle w:val="Compact"/>
-        <w:numPr>
-          <w:ilvl w:val="0"/>
-          <w:numId w:val="1007"/>
-        </w:numPr>
-      </w:pPr>
-      <w:r>
-        <w:t xml:space="preserve">Map LIMS data flow; define exception business rules with lab managers</w:t>
-      </w:r>
-    </w:p>
-    <w:p>
-      <w:pPr>
-        <w:pStyle w:val="Compact"/>
-        <w:numPr>
-          <w:ilvl w:val="0"/>
-          <w:numId w:val="1007"/>
-        </w:numPr>
-      </w:pPr>
-      <w:r>
-        <w:t xml:space="preserve">Build AI-assisted exception detection layer (Python or prompt chain)</w:t>
-      </w:r>
-    </w:p>
-    <w:p>
-      <w:pPr>
-        <w:pStyle w:val="Compact"/>
-        <w:numPr>
-          <w:ilvl w:val="0"/>
-          <w:numId w:val="1007"/>
-        </w:numPr>
-      </w:pPr>
-      <w:r>
-        <w:t xml:space="preserve">Notification architecture: flag → alert → channel</w:t>
-      </w:r>
-    </w:p>
-    <w:p>
-      <w:pPr>
-        <w:pStyle w:val="Compact"/>
-        <w:numPr>
-          <w:ilvl w:val="0"/>
-          <w:numId w:val="1007"/>
-        </w:numPr>
-      </w:pPr>
-      <w:r>
-        <w:t xml:space="preserve">Autolab upstream integration specification</w:t>
-      </w:r>
-    </w:p>
-    <w:bookmarkEnd w:id="16"/>
-    <w:bookmarkStart w:id="17" w:name="Xb592eadc4987769ab3cb8a6998a92cfc45153f4"/>
-    <w:p>
-      <w:pPr>
-        <w:pStyle w:val="Heading3"/>
-      </w:pPr>
-      <w:r>
-        <w:t xml:space="preserve">Session 8 — Agentic Workflows &amp; Automation Pipelines</w:t>
-      </w:r>
-    </w:p>
-    <w:p>
-      <w:pPr>
-        <w:pStyle w:val="Compact"/>
-        <w:numPr>
-          <w:ilvl w:val="0"/>
-          <w:numId w:val="1008"/>
-        </w:numPr>
-      </w:pPr>
-      <w:r>
-        <w:t xml:space="preserve">Build multi-step agentic workflow: data → AI check → exception → alert → human review</w:t>
-      </w:r>
-    </w:p>
-    <w:p>
-      <w:pPr>
-        <w:pStyle w:val="Compact"/>
-        <w:numPr>
-          <w:ilvl w:val="0"/>
-          <w:numId w:val="1008"/>
-        </w:numPr>
-      </w:pPr>
-      <w:r>
-        <w:t xml:space="preserve">n8n automation pipelines — pre-built scaffold, configure and extend</w:t>
-      </w:r>
-    </w:p>
-    <w:p>
-      <w:pPr>
-        <w:pStyle w:val="Compact"/>
-        <w:numPr>
-          <w:ilvl w:val="0"/>
-          <w:numId w:val="1008"/>
-        </w:numPr>
-      </w:pPr>
-      <w:r>
-        <w:t xml:space="preserve">Failure modes, human override, and audit trail design</w:t>
-      </w:r>
-    </w:p>
-    <w:p>
-      <w:pPr>
-        <w:pStyle w:val="Compact"/>
-        <w:numPr>
-          <w:ilvl w:val="0"/>
-          <w:numId w:val="1008"/>
-        </w:numPr>
-      </w:pPr>
-      <w:r>
-        <w:t xml:space="preserve">Each participant maps one workflow for full automation</w:t>
-      </w:r>
-    </w:p>
-    <w:bookmarkEnd w:id="17"/>
-    <w:bookmarkStart w:id="18" w:name="Xd01cd2a08c799328e5dfd580e23a6d202e71d09"/>
-    <w:p>
-      <w:pPr>
-        <w:pStyle w:val="Heading3"/>
-      </w:pPr>
-      <w:r>
-        <w:t xml:space="preserve">Session 9 — Source System Integration &amp; Deployment</w:t>
-      </w:r>
-    </w:p>
-    <w:p>
-      <w:pPr>
-        <w:pStyle w:val="Compact"/>
-        <w:numPr>
-          <w:ilvl w:val="0"/>
-          <w:numId w:val="1009"/>
-        </w:numPr>
-      </w:pPr>
-      <w:r>
-        <w:t xml:space="preserve">Build functional integration prototypes from Session 8 maps</w:t>
-      </w:r>
-    </w:p>
-    <w:p>
-      <w:pPr>
-        <w:pStyle w:val="Compact"/>
-        <w:numPr>
-          <w:ilvl w:val="0"/>
-          <w:numId w:val="1009"/>
-        </w:numPr>
-      </w:pPr>
-      <w:r>
-        <w:t xml:space="preserve">API connector pattern (Node.js/Python): AI layer ↔ source system, no manual exports</w:t>
-      </w:r>
-    </w:p>
-    <w:p>
-      <w:pPr>
-        <w:pStyle w:val="Compact"/>
-        <w:numPr>
-          <w:ilvl w:val="0"/>
-          <w:numId w:val="1009"/>
-        </w:numPr>
-      </w:pPr>
-      <w:r>
-        <w:t xml:space="preserve">Autolab-to-LIMS chain review and partial live implementation</w:t>
-      </w:r>
-    </w:p>
-    <w:p>
-      <w:pPr>
-        <w:pStyle w:val="Compact"/>
-        <w:numPr>
-          <w:ilvl w:val="0"/>
-          <w:numId w:val="1009"/>
-        </w:numPr>
-      </w:pPr>
-      <w:r>
-        <w:t xml:space="preserve">SASA AI architecture diagram + deployment checklist</w:t>
-      </w:r>
-    </w:p>
-    <w:bookmarkEnd w:id="18"/>
-    <w:bookmarkStart w:id="19" w:name="session-10-capstone-governance-roadmap"/>
-    <w:p>
-      <w:pPr>
-        <w:pStyle w:val="Heading3"/>
-      </w:pPr>
-      <w:r>
-        <w:t xml:space="preserve">Session 10 — Capstone, Governance &amp; Roadmap</w:t>
-      </w:r>
-    </w:p>
-    <w:p>
-      <w:pPr>
-        <w:pStyle w:val="Compact"/>
-        <w:numPr>
-          <w:ilvl w:val="0"/>
-          <w:numId w:val="1010"/>
-        </w:numPr>
-      </w:pPr>
-      <w:r>
-        <w:t xml:space="preserve">Live demos of all integrations built across the programme (directors present)</w:t>
-      </w:r>
-    </w:p>
-    <w:p>
-      <w:pPr>
-        <w:pStyle w:val="Compact"/>
-        <w:numPr>
-          <w:ilvl w:val="0"/>
-          <w:numId w:val="1010"/>
-        </w:numPr>
-      </w:pPr>
-      <w:r>
-        <w:t xml:space="preserve">Structured review against Session 1 targets</w:t>
-      </w:r>
-    </w:p>
-    <w:p>
-      <w:pPr>
-        <w:pStyle w:val="Compact"/>
-        <w:numPr>
-          <w:ilvl w:val="0"/>
-          <w:numId w:val="1010"/>
-        </w:numPr>
-      </w:pPr>
-      <w:r>
-        <w:t xml:space="preserve">SASA AI governance framework: acceptable use, data classification, prompt library ownership</w:t>
-      </w:r>
-    </w:p>
-    <w:p>
-      <w:pPr>
-        <w:pStyle w:val="Compact"/>
-        <w:numPr>
-          <w:ilvl w:val="0"/>
-          <w:numId w:val="1010"/>
         </w:numPr>
       </w:pPr>
       <w:r>
@@ -691,9 +459,9 @@
         </w:pict>
       </w:r>
     </w:p>
-    <w:bookmarkEnd w:id="19"/>
-    <w:bookmarkEnd w:id="20"/>
-    <w:bookmarkStart w:id="21" w:name="investment"/>
+    <w:bookmarkEnd w:id="15"/>
+    <w:bookmarkEnd w:id="16"/>
+    <w:bookmarkStart w:id="17" w:name="investment"/>
     <w:p>
       <w:pPr>
         <w:pStyle w:val="Heading2"/>
@@ -784,7 +552,7 @@
               <w:pStyle w:val="Compact"/>
             </w:pPr>
             <w:r>
-              <w:t xml:space="preserve">Full programme</w:t>
+              <w:t xml:space="preserve">6-session programme</w:t>
             </w:r>
           </w:p>
         </w:tc>
@@ -795,7 +563,7 @@
               <w:pStyle w:val="Compact"/>
             </w:pPr>
             <w:r>
-              <w:t xml:space="preserve">10 × 7 hrs @ R3,500</w:t>
+              <w:t xml:space="preserve">6 × 7 hrs @ R3,500</w:t>
             </w:r>
           </w:p>
         </w:tc>
@@ -806,7 +574,7 @@
               <w:pStyle w:val="Compact"/>
             </w:pPr>
             <w:r>
-              <w:t xml:space="preserve">R35,000</w:t>
+              <w:t xml:space="preserve">R21,000</w:t>
             </w:r>
           </w:p>
         </w:tc>
@@ -817,7 +585,7 @@
               <w:pStyle w:val="Compact"/>
             </w:pPr>
             <w:r>
-              <w:t xml:space="preserve">R5,250</w:t>
+              <w:t xml:space="preserve">R3,150</w:t>
             </w:r>
           </w:p>
         </w:tc>
@@ -832,7 +600,7 @@
                 <w:b/>
                 <w:bCs/>
               </w:rPr>
-              <w:t xml:space="preserve">R40,250</w:t>
+              <w:t xml:space="preserve">R24,150</w:t>
             </w:r>
           </w:p>
         </w:tc>
@@ -845,7 +613,7 @@
               <w:pStyle w:val="Compact"/>
             </w:pPr>
             <w:r>
-              <w:t xml:space="preserve">Reduced option</w:t>
+              <w:t xml:space="preserve">Extension (Sessions 7–10)</w:t>
             </w:r>
           </w:p>
         </w:tc>
@@ -856,7 +624,7 @@
               <w:pStyle w:val="Compact"/>
             </w:pPr>
             <w:r>
-              <w:t xml:space="preserve">8 × 7 hrs @ R3,500</w:t>
+              <w:t xml:space="preserve">4 × 7 hrs @ R3,500</w:t>
             </w:r>
           </w:p>
         </w:tc>
@@ -867,7 +635,7 @@
               <w:pStyle w:val="Compact"/>
             </w:pPr>
             <w:r>
-              <w:t xml:space="preserve">R28,000</w:t>
+              <w:t xml:space="preserve">R14,000</w:t>
             </w:r>
           </w:p>
         </w:tc>
@@ -878,7 +646,7 @@
               <w:pStyle w:val="Compact"/>
             </w:pPr>
             <w:r>
-              <w:t xml:space="preserve">R4,200</w:t>
+              <w:t xml:space="preserve">R2,100</w:t>
             </w:r>
           </w:p>
         </w:tc>
@@ -893,7 +661,7 @@
                 <w:b/>
                 <w:bCs/>
               </w:rPr>
-              <w:t xml:space="preserve">R32,200</w:t>
+              <w:t xml:space="preserve">R16,100</w:t>
             </w:r>
           </w:p>
         </w:tc>
@@ -908,7 +676,7 @@
           <w:i/>
           <w:iCs/>
         </w:rPr>
-        <w:t xml:space="preserve">Reduced option defers Sessions 9–10 to a subsequent engagement. Sessions invoiced individually on completion.</w:t>
+        <w:t xml:space="preserve">Sessions invoiced individually on completion. Extension covers LIMS integration, agentic workflows, source system deployment, and capstone review.</w:t>
       </w:r>
     </w:p>
     <w:p>
@@ -942,8 +710,8 @@
         <w:t xml:space="preserve">Richard [Surname] | [Email] | [Phone] | [Company]</w:t>
       </w:r>
     </w:p>
-    <w:bookmarkEnd w:id="21"/>
-    <w:bookmarkEnd w:id="22"/>
+    <w:bookmarkEnd w:id="17"/>
+    <w:bookmarkEnd w:id="18"/>
     <w:sectPr>
       <w:footnotePr>
         <w:numRestart w:val="eachSect"/>
@@ -1176,18 +944,6 @@
     <w:abstractNumId w:val="991"/>
   </w:num>
   <w:num w:numId="1006">
-    <w:abstractNumId w:val="991"/>
-  </w:num>
-  <w:num w:numId="1007">
-    <w:abstractNumId w:val="991"/>
-  </w:num>
-  <w:num w:numId="1008">
-    <w:abstractNumId w:val="991"/>
-  </w:num>
-  <w:num w:numId="1009">
-    <w:abstractNumId w:val="991"/>
-  </w:num>
-  <w:num w:numId="1010">
     <w:abstractNumId w:val="991"/>
   </w:num>
 </w:numbering>

</xml_diff>